<commit_message>
Medicare certificate: add signature roles under names
Co-Authored-By: Claude Opus 5.5 <noreply@anthropic.com>
Claude-Session: https://claude.ai/code/session_01DP2bf5JSdcg2G8WKtQbPFu
</commit_message>
<xml_diff>
--- a/report/Medicare_MAD_Complete_Report.docx
+++ b/report/Medicare_MAD_Complete_Report.docx
@@ -611,47 +611,225 @@
     </w:p>
     <w:p>
       <w:pPr>
-        <w:spacing w:after="1200" w:before="0" w:line="240" w:lineRule="auto"/>
-      </w:pPr>
-    </w:p>
-    <w:p>
-      <w:pPr>
-        <w:spacing w:after="0" w:before="0" w:line="240" w:lineRule="auto"/>
-      </w:pPr>
-      <w:r>
-        <w:rPr>
-          <w:rFonts w:ascii="Times New Roman" w:hAnsi="Times New Roman" w:cs="Times New Roman" w:eastAsia="Times New Roman"/>
-          <w:b w:val="0"/>
-          <w:i w:val="0"/>
-          <w:sz w:val="24"/>
-          <w:u w:val="none"/>
-        </w:rPr>
-        <w:t>______________________        ______________________        ____________________</w:t>
-      </w:r>
-    </w:p>
-    <w:p>
-      <w:pPr>
-        <w:tabs>
-          <w:tab w:pos="3744" w:val="left"/>
-          <w:tab w:pos="7128" w:val="left"/>
-        </w:tabs>
-        <w:spacing w:after="0" w:before="280" w:line="240" w:lineRule="auto"/>
-      </w:pPr>
-      <w:r>
-        <w:rPr>
-          <w:rFonts w:ascii="Times New Roman" w:hAnsi="Times New Roman" w:cs="Times New Roman" w:eastAsia="Times New Roman"/>
-          <w:b/>
-          <w:i w:val="0"/>
-          <w:sz w:val="28"/>
-          <w:u w:val="none"/>
-        </w:rPr>
-        <w:t xml:space="preserve">  Smt.H.S.Pawar</w:t>
-        <w:tab/>
-        <w:t xml:space="preserve">   Smt.J.R.Hange</w:t>
-        <w:tab/>
-        <w:t xml:space="preserve">    Dr.R.K.Patil</w:t>
-      </w:r>
-    </w:p>
+        <w:spacing w:after="800" w:before="0" w:line="240" w:lineRule="auto"/>
+      </w:pPr>
+    </w:p>
+    <w:tbl>
+      <w:tblPr>
+        <w:tblW w:type="auto" w:w="0"/>
+        <w:jc w:val="center"/>
+        <w:tblLook w:firstColumn="1" w:firstRow="1" w:lastColumn="0" w:lastRow="0" w:noHBand="0" w:noVBand="1" w:val="04A0"/>
+      </w:tblPr>
+      <w:tblGrid>
+        <w:gridCol w:w="3120"/>
+        <w:gridCol w:w="3120"/>
+        <w:gridCol w:w="3120"/>
+      </w:tblGrid>
+      <w:tr>
+        <w:tc>
+          <w:tcPr>
+            <w:tcW w:type="dxa" w:w="3096"/>
+          </w:tcPr>
+          <w:p>
+            <w:pPr>
+              <w:spacing w:before="0"/>
+              <w:jc w:val="center"/>
+            </w:pPr>
+            <w:r/>
+            <w:r>
+              <w:rPr>
+                <w:rFonts w:ascii="Times New Roman" w:hAnsi="Times New Roman" w:cs="Times New Roman" w:eastAsia="Times New Roman"/>
+                <w:b w:val="0"/>
+                <w:i w:val="0"/>
+                <w:sz w:val="24"/>
+                <w:u w:val="none"/>
+              </w:rPr>
+              <w:t>_____________________</w:t>
+            </w:r>
+          </w:p>
+        </w:tc>
+        <w:tc>
+          <w:tcPr>
+            <w:tcW w:type="dxa" w:w="3096"/>
+          </w:tcPr>
+          <w:p>
+            <w:pPr>
+              <w:spacing w:before="0"/>
+              <w:jc w:val="center"/>
+            </w:pPr>
+            <w:r/>
+            <w:r>
+              <w:rPr>
+                <w:rFonts w:ascii="Times New Roman" w:hAnsi="Times New Roman" w:cs="Times New Roman" w:eastAsia="Times New Roman"/>
+                <w:b w:val="0"/>
+                <w:i w:val="0"/>
+                <w:sz w:val="24"/>
+                <w:u w:val="none"/>
+              </w:rPr>
+              <w:t>_____________________</w:t>
+            </w:r>
+          </w:p>
+        </w:tc>
+        <w:tc>
+          <w:tcPr>
+            <w:tcW w:type="dxa" w:w="3096"/>
+          </w:tcPr>
+          <w:p>
+            <w:pPr>
+              <w:spacing w:before="0"/>
+              <w:jc w:val="center"/>
+            </w:pPr>
+            <w:r/>
+            <w:r>
+              <w:rPr>
+                <w:rFonts w:ascii="Times New Roman" w:hAnsi="Times New Roman" w:cs="Times New Roman" w:eastAsia="Times New Roman"/>
+                <w:b w:val="0"/>
+                <w:i w:val="0"/>
+                <w:sz w:val="24"/>
+                <w:u w:val="none"/>
+              </w:rPr>
+              <w:t>_____________________</w:t>
+            </w:r>
+          </w:p>
+        </w:tc>
+      </w:tr>
+      <w:tr>
+        <w:tc>
+          <w:tcPr>
+            <w:tcW w:type="dxa" w:w="3096"/>
+          </w:tcPr>
+          <w:p>
+            <w:pPr>
+              <w:spacing w:before="240"/>
+              <w:jc w:val="center"/>
+            </w:pPr>
+            <w:r/>
+            <w:r>
+              <w:rPr>
+                <w:rFonts w:ascii="Times New Roman" w:hAnsi="Times New Roman" w:cs="Times New Roman" w:eastAsia="Times New Roman"/>
+                <w:b/>
+                <w:i w:val="0"/>
+                <w:sz w:val="28"/>
+                <w:u w:val="none"/>
+              </w:rPr>
+              <w:t>Smt.H.S.Pawar</w:t>
+            </w:r>
+          </w:p>
+        </w:tc>
+        <w:tc>
+          <w:tcPr>
+            <w:tcW w:type="dxa" w:w="3096"/>
+          </w:tcPr>
+          <w:p>
+            <w:pPr>
+              <w:spacing w:before="240"/>
+              <w:jc w:val="center"/>
+            </w:pPr>
+            <w:r/>
+            <w:r>
+              <w:rPr>
+                <w:rFonts w:ascii="Times New Roman" w:hAnsi="Times New Roman" w:cs="Times New Roman" w:eastAsia="Times New Roman"/>
+                <w:b/>
+                <w:i w:val="0"/>
+                <w:sz w:val="28"/>
+                <w:u w:val="none"/>
+              </w:rPr>
+              <w:t>Smt.J.R.Hange</w:t>
+            </w:r>
+          </w:p>
+        </w:tc>
+        <w:tc>
+          <w:tcPr>
+            <w:tcW w:type="dxa" w:w="3096"/>
+          </w:tcPr>
+          <w:p>
+            <w:pPr>
+              <w:spacing w:before="240"/>
+              <w:jc w:val="center"/>
+            </w:pPr>
+            <w:r/>
+            <w:r>
+              <w:rPr>
+                <w:rFonts w:ascii="Times New Roman" w:hAnsi="Times New Roman" w:cs="Times New Roman" w:eastAsia="Times New Roman"/>
+                <w:b/>
+                <w:i w:val="0"/>
+                <w:sz w:val="28"/>
+                <w:u w:val="none"/>
+              </w:rPr>
+              <w:t>Dr.R.K.Patil</w:t>
+            </w:r>
+          </w:p>
+        </w:tc>
+      </w:tr>
+      <w:tr>
+        <w:tc>
+          <w:tcPr>
+            <w:tcW w:type="dxa" w:w="3096"/>
+          </w:tcPr>
+          <w:p>
+            <w:pPr>
+              <w:spacing w:before="240"/>
+              <w:jc w:val="center"/>
+            </w:pPr>
+            <w:r/>
+            <w:r>
+              <w:rPr>
+                <w:rFonts w:ascii="Times New Roman" w:hAnsi="Times New Roman" w:cs="Times New Roman" w:eastAsia="Times New Roman"/>
+                <w:b/>
+                <w:i w:val="0"/>
+                <w:sz w:val="28"/>
+                <w:u w:val="none"/>
+              </w:rPr>
+              <w:t>(Microproject Guide)</w:t>
+            </w:r>
+          </w:p>
+        </w:tc>
+        <w:tc>
+          <w:tcPr>
+            <w:tcW w:type="dxa" w:w="3096"/>
+          </w:tcPr>
+          <w:p>
+            <w:pPr>
+              <w:spacing w:before="240"/>
+              <w:jc w:val="center"/>
+            </w:pPr>
+            <w:r/>
+            <w:r>
+              <w:rPr>
+                <w:rFonts w:ascii="Times New Roman" w:hAnsi="Times New Roman" w:cs="Times New Roman" w:eastAsia="Times New Roman"/>
+                <w:b/>
+                <w:i w:val="0"/>
+                <w:sz w:val="28"/>
+                <w:u w:val="none"/>
+              </w:rPr>
+              <w:t>(Head of Department)</w:t>
+            </w:r>
+          </w:p>
+        </w:tc>
+        <w:tc>
+          <w:tcPr>
+            <w:tcW w:type="dxa" w:w="3096"/>
+          </w:tcPr>
+          <w:p>
+            <w:pPr>
+              <w:spacing w:before="240"/>
+              <w:jc w:val="center"/>
+            </w:pPr>
+            <w:r/>
+            <w:r>
+              <w:rPr>
+                <w:rFonts w:ascii="Times New Roman" w:hAnsi="Times New Roman" w:cs="Times New Roman" w:eastAsia="Times New Roman"/>
+                <w:b/>
+                <w:i w:val="0"/>
+                <w:sz w:val="28"/>
+                <w:u w:val="none"/>
+              </w:rPr>
+              <w:t>(Principal)</w:t>
+            </w:r>
+          </w:p>
+        </w:tc>
+      </w:tr>
+    </w:tbl>
     <w:p>
       <w:r>
         <w:br w:type="page"/>

</xml_diff>

<commit_message>
Medicare report: update enrollment number to 2406088
Co-Authored-By: Claude Opus 5.5 <noreply@anthropic.com>
Claude-Session: https://claude.ai/code/session_01DP2bf5JSdcg2G8WKtQbPFu
</commit_message>
<xml_diff>
--- a/report/Medicare_MAD_Complete_Report.docx
+++ b/report/Medicare_MAD_Complete_Report.docx
@@ -240,7 +240,7 @@
                 <w:sz w:val="24"/>
                 <w:u w:val="none"/>
               </w:rPr>
-              <w:t>24056085</w:t>
+              <w:t>2406088</w:t>
             </w:r>
           </w:p>
         </w:tc>
@@ -526,7 +526,7 @@
                 <w:sz w:val="24"/>
                 <w:u w:val="none"/>
               </w:rPr>
-              <w:t>24056085</w:t>
+              <w:t>2406088</w:t>
             </w:r>
           </w:p>
         </w:tc>

</xml_diff>